<commit_message>
fix(eda,docs): resolve species extraction for EUS, unify pHash threshold to <=5 and update progress report
</commit_message>
<xml_diff>
--- a/DoAnDraft_v1.docx
+++ b/DoAnDraft_v1.docx
@@ -3344,7 +3344,7 @@
           <w:sz w:val="26"/>
           <w:szCs w:val="26"/>
         </w:rPr>
-        <w:t>Để cụ thể hóa quy mô và cấu trúc của dữ liệu thực nghiệm, toàn bộ tập dữ liệu thô sau khi được thu thập từ nguồn MatsyaDx-BD đã trải qua quá trình tiền xử lý, loại bỏ ảnh lỗi bằng thuật toán pHash và phân chia theo mã định danh cá thể (specimen_id) nhằm triệt tiêu hiện tượng rò rỉ dữ liệu (data leakage). Kết quả phân phối cụ thể trên các tập huấn luyện, kiểm định và kiểm thử được tổng hợp</w:t>
+        <w:t>Để cụ thể hóa quy mô và cấu trúc của dữ liệu thực nghiệm, toàn bộ tập dữ liệu thô sau khi được thu thập từ nguồn MatsyaDx-BD đã trải qua quá trình tiền xử lý, loại bỏ ảnh lỗi bằng thuật toán pHash và phân chia theo mã định danh cá thể (specimen_id) nhằm hạn chế tối đa nguy cơ rò rỉ dữ liệu (data leakage). Kết quả phân phối cụ thể trên các tập huấn luyện, kiểm định và kiểm thử được tổng hợp</w:t>
       </w:r>
       <w:r>
         <w:rPr>
@@ -4614,100 +4614,7 @@
         </w:rPr>
       </w:pPr>
       <w:r>
-        <w:rPr>
-          <w:rFonts w:hint="default" w:ascii="Times New Roman" w:hAnsi="Times New Roman" w:eastAsia="SimSun" w:cs="Times New Roman"/>
-          <w:kern w:val="0"/>
-          <w:sz w:val="26"/>
-          <w:szCs w:val="26"/>
-          <w:lang w:val="en-US" w:eastAsia="zh-CN" w:bidi="ar"/>
-        </w:rPr>
-        <w:t>Thông qua bước kiểm tra thủ công ngẫu nhiên 30 cặp ảnh mẫu (</w:t>
-      </w:r>
-      <w:r>
-        <w:rPr>
-          <w:rFonts w:hint="default" w:ascii="Times New Roman" w:hAnsi="Times New Roman" w:eastAsia="sans-serif" w:cs="Times New Roman"/>
-          <w:i/>
-          <w:iCs/>
-          <w:kern w:val="0"/>
-          <w:sz w:val="26"/>
-          <w:szCs w:val="26"/>
-          <w:lang w:val="en-US" w:eastAsia="zh-CN" w:bidi="ar"/>
-        </w:rPr>
-        <w:t>original</w:t>
-      </w:r>
-      <w:r>
-        <w:rPr>
-          <w:rFonts w:hint="default" w:ascii="Times New Roman" w:hAnsi="Times New Roman" w:eastAsia="SimSun" w:cs="Times New Roman"/>
-          <w:kern w:val="0"/>
-          <w:sz w:val="26"/>
-          <w:szCs w:val="26"/>
-          <w:lang w:val="en-US" w:eastAsia="zh-CN" w:bidi="ar"/>
-        </w:rPr>
-        <w:t xml:space="preserve"> và </w:t>
-      </w:r>
-      <w:r>
-        <w:rPr>
-          <w:rFonts w:hint="default" w:ascii="Times New Roman" w:hAnsi="Times New Roman" w:eastAsia="sans-serif" w:cs="Times New Roman"/>
-          <w:i/>
-          <w:iCs/>
-          <w:kern w:val="0"/>
-          <w:sz w:val="26"/>
-          <w:szCs w:val="26"/>
-          <w:lang w:val="en-US" w:eastAsia="zh-CN" w:bidi="ar"/>
-        </w:rPr>
-        <w:t>duplicate</w:t>
-      </w:r>
-      <w:r>
-        <w:rPr>
-          <w:rFonts w:hint="default" w:ascii="Times New Roman" w:hAnsi="Times New Roman" w:eastAsia="SimSun" w:cs="Times New Roman"/>
-          <w:kern w:val="0"/>
-          <w:sz w:val="26"/>
-          <w:szCs w:val="26"/>
-          <w:lang w:val="en-US" w:eastAsia="zh-CN" w:bidi="ar"/>
-        </w:rPr>
-        <w:t xml:space="preserve">) được xuất tự động từ hệ thống kiểm toán, kết quả xác nhận rằng ngưỡng lựa chọn </w:t>
-      </w:r>
-      <w:r>
-        <w:rPr>
-          <w:rFonts w:hint="default" w:ascii="Times New Roman" w:hAnsi="Times New Roman" w:eastAsia="sans-serif" w:cs="Times New Roman"/>
-          <w:kern w:val="0"/>
-          <w:sz w:val="26"/>
-          <w:szCs w:val="26"/>
-          <w:lang w:val="en-US" w:eastAsia="zh-CN" w:bidi="ar"/>
-        </w:rPr>
-        <w:t>bé hơn bằng 5</w:t>
-      </w:r>
-      <w:r>
-        <w:rPr>
-          <w:rFonts w:hint="default" w:ascii="Times New Roman" w:hAnsi="Times New Roman" w:eastAsia="SimSun" w:cs="Times New Roman"/>
-          <w:kern w:val="0"/>
-          <w:sz w:val="26"/>
-          <w:szCs w:val="26"/>
-          <w:lang w:val="en-US" w:eastAsia="zh-CN" w:bidi="ar"/>
-        </w:rPr>
-        <w:t xml:space="preserve"> đã loại bỏ chính xác các khung hình trùng lặp góc chụp, đồng thời </w:t>
-      </w:r>
-      <w:r>
-        <w:rPr>
-          <w:rFonts w:hint="default" w:ascii="Times New Roman" w:hAnsi="Times New Roman" w:eastAsia="sans-serif" w:cs="Times New Roman"/>
-          <w:b w:val="0"/>
-          <w:bCs w:val="0"/>
-          <w:kern w:val="0"/>
-          <w:sz w:val="26"/>
-          <w:szCs w:val="26"/>
-          <w:lang w:val="en-US" w:eastAsia="zh-CN" w:bidi="ar"/>
-        </w:rPr>
-        <w:t>tuyệt đối không xảy ra hiện tượng xóa nhầm</w:t>
-      </w:r>
-      <w:r>
-        <w:rPr>
-          <w:rFonts w:hint="default" w:ascii="Times New Roman" w:hAnsi="Times New Roman" w:eastAsia="SimSun" w:cs="Times New Roman"/>
-          <w:kern w:val="0"/>
-          <w:sz w:val="26"/>
-          <w:szCs w:val="26"/>
-          <w:lang w:val="en-US" w:eastAsia="zh-CN" w:bidi="ar"/>
-        </w:rPr>
-        <w:t xml:space="preserve"> các triệu chứng bệnh lý khác nhau giữa các lớp dữ liệu."</w:t>
+        <w:t>Để đánh giá độ tin cậy của bộ lọc trùng lặp, một mẫu ngẫu nhiên gồm 30 cặp ảnh (original và duplicate) đã được trích xuất tự động từ hệ thống kiểm toán để tiến hành kiểm tra nghiệm thu. Kết quả cho thấy: trong 30 cặp được kiểm tra thủ công, chưa phát hiện trường hợp loại nhầm các tổn thương bệnh lý thực sự giữa các lớp dữ liệu.</w:t>
       </w:r>
     </w:p>
     <w:p>
@@ -4770,6 +4677,11 @@
             </a:graphic>
           </wp:inline>
         </w:drawing>
+      </w:r>
+    </w:p>
+    <w:p>
+      <w:r>
+        <w:t>Về phân bố các loài cá trong bộ dữ liệu thực nghiệm: Toàn bộ 1.201 ảnh sạch thuộc bộ dữ liệu MatsyaDx-BD được thu thập trên 3 loài cá nước ngọt phổ biến trong nuôi trồng thủy sản: Cá trôi Ấn Độ (Labeo rohita - Rui) chiếm 529 ảnh (44,05%); Cá trắm cỏ (Ctenopharyngodon idella - Grass carp) chiếm 349 ảnh (29,06%); và Cá mè trắng (Hypophthalmichthys molitrix - Silver carp) chiếm 323 ảnh (26,89%). Cả 4 lớp trạng thái (bao gồm cả hội chứng lở loét EUS) đều được định danh loài cá đầy đủ ở cấp độ taxon khoa học, không có mẫu ảnh nào thiếu thông tin loài (Unknown/Not provided = 0).</w:t>
       </w:r>
     </w:p>
     <w:p>

</xml_diff>